<commit_message>
objetivos 5 y 6
</commit_message>
<xml_diff>
--- a/Trabajo integrador y plan de proyecto/Plan_de_Proyecto_Cambio_Climatico_Argentina_CORREGIDO.docx
+++ b/Trabajo integrador y plan de proyecto/Plan_de_Proyecto_Cambio_Climatico_Argentina_CORREGIDO.docx
@@ -9861,6 +9861,7 @@
         <w:gridCol w:w="2379"/>
         <w:gridCol w:w="2379"/>
         <w:gridCol w:w="2379"/>
+        <w:gridCol w:w="1701"/>
       </w:tblGrid>
       <w:tr>
         <w:trPr>
@@ -9951,6 +9952,16 @@
             </w:r>
           </w:p>
         </w:tc>
+        <w:tc>
+          <w:tcPr>
+            <w:tcW w:type="dxa" w:w="1701"/>
+          </w:tcPr>
+          <w:p>
+            <w:r>
+              <w:t>Estado real (19/10)</w:t>
+            </w:r>
+          </w:p>
+        </w:tc>
       </w:tr>
       <w:tr>
         <w:trPr>
@@ -10032,6 +10043,16 @@
             </w:r>
           </w:p>
         </w:tc>
+        <w:tc>
+          <w:tcPr>
+            <w:tcW w:type="dxa" w:w="1701"/>
+          </w:tcPr>
+          <w:p>
+            <w:r>
+              <w:t>Completada</w:t>
+            </w:r>
+          </w:p>
+        </w:tc>
       </w:tr>
       <w:tr>
         <w:trPr>
@@ -10117,6 +10138,16 @@
             </w:r>
           </w:p>
         </w:tc>
+        <w:tc>
+          <w:tcPr>
+            <w:tcW w:type="dxa" w:w="1701"/>
+          </w:tcPr>
+          <w:p>
+            <w:r>
+              <w:t>Completada</w:t>
+            </w:r>
+          </w:p>
+        </w:tc>
       </w:tr>
       <w:tr>
         <w:trPr>
@@ -10198,6 +10229,16 @@
             </w:r>
           </w:p>
         </w:tc>
+        <w:tc>
+          <w:tcPr>
+            <w:tcW w:type="dxa" w:w="1701"/>
+          </w:tcPr>
+          <w:p>
+            <w:r>
+              <w:t>Completada</w:t>
+            </w:r>
+          </w:p>
+        </w:tc>
       </w:tr>
       <w:tr>
         <w:trPr>
@@ -10283,6 +10324,16 @@
             </w:r>
           </w:p>
         </w:tc>
+        <w:tc>
+          <w:tcPr>
+            <w:tcW w:type="dxa" w:w="1701"/>
+          </w:tcPr>
+          <w:p>
+            <w:r>
+              <w:t>Ejecutada (objetivos 1-5)</w:t>
+            </w:r>
+          </w:p>
+        </w:tc>
       </w:tr>
       <w:tr>
         <w:trPr>
@@ -10364,6 +10415,16 @@
             </w:r>
           </w:p>
         </w:tc>
+        <w:tc>
+          <w:tcPr>
+            <w:tcW w:type="dxa" w:w="1701"/>
+          </w:tcPr>
+          <w:p>
+            <w:r>
+              <w:t>Ejecutada (objetivo 6)</w:t>
+            </w:r>
+          </w:p>
+        </w:tc>
       </w:tr>
       <w:tr>
         <w:trPr>
@@ -10446,6 +10507,16 @@
                 <w:sz w:val="19"/>
               </w:rPr>
               <w:t>Interfaz, informe final, presentación y entrega</w:t>
+            </w:r>
+          </w:p>
+        </w:tc>
+        <w:tc>
+          <w:tcPr>
+            <w:tcW w:type="dxa" w:w="1701"/>
+          </w:tcPr>
+          <w:p>
+            <w:r>
+              <w:t>En curso (interfaz lista)</w:t>
             </w:r>
           </w:p>
         </w:tc>
@@ -19180,6 +19251,22 @@
           <w:sz w:val="18"/>
         </w:rPr>
         <w:t>——————————————————————————————</w:t>
+      </w:r>
+    </w:p>
+    <w:p>
+      <w:pPr>
+        <w:pStyle w:val="Heading2"/>
+      </w:pPr>
+      <w:r>
+        <w:t>Nota de estado (agregada el 19/10/2026)</w:t>
+      </w:r>
+    </w:p>
+    <w:p>
+      <w:r>
+        <w:rPr>
+          <w:i/>
+        </w:rPr>
+        <w:t>A la fecha de esta nota, las fases de Modeling y Evaluation ya fueron ejecutadas: los objetivos 5 (modelos predictivos) y 6 (evaluacion frente al baseline) estan implementados en la interfaz Streamlit y en el script reproducible modelos.py. El cronograma original las preveia para las semanas 7 y 8; se completaron antes. El resultado confirma la regla de decision fijada de antemano (ningun modelo supera al baseline de persistencia) y la hipotesis H3 se rechaza, documentandose el resultado negativo.</w:t>
       </w:r>
     </w:p>
     <w:p>

</xml_diff>